<commit_message>
major updates and fixes on docx and buttons
</commit_message>
<xml_diff>
--- a/backend/templates/fsic-bfp.docx
+++ b/backend/templates/fsic-bfp.docx
@@ -443,7 +443,7 @@
                 <wp:positionV relativeFrom="paragraph">
                   <wp:posOffset>81915</wp:posOffset>
                 </wp:positionV>
-                <wp:extent cx="1892300" cy="341630"/>
+                <wp:extent cx="2778760" cy="341630"/>
                 <wp:effectExtent l="0" t="0" r="0" b="0"/>
                 <wp:wrapNone/>
                 <wp:docPr id="22" name="Text Box 22"/>
@@ -455,7 +455,7 @@
                       <wps:spPr>
                         <a:xfrm>
                           <a:off x="0" y="0"/>
-                          <a:ext cx="1892300" cy="341906"/>
+                          <a:ext cx="2778760" cy="341906"/>
                         </a:xfrm>
                         <a:prstGeom prst="rect">
                           <a:avLst/>
@@ -485,6 +485,17 @@
                           <w:p>
                             <w:r>
                               <w:rPr>
+                                <w:rFonts w:hint="default" w:ascii="Arial" w:hAnsi="Arial" w:cs="Arial"/>
+                                <w:b/>
+                                <w:color w:val="FF0000"/>
+                                <w:sz w:val="32"/>
+                                <w:szCs w:val="32"/>
+                                <w:lang w:val="en-US"/>
+                              </w:rPr>
+                              <w:t>R10-</w:t>
+                            </w:r>
+                            <w:r>
+                              <w:rPr>
                                 <w:rFonts w:ascii="Arial" w:hAnsi="Arial" w:cs="Arial"/>
                                 <w:b/>
                                 <w:color w:val="FF0000"/>
@@ -569,7 +580,7 @@
           </mc:Choice>
           <mc:Fallback>
             <w:pict>
-              <v:shape id="_x0000_s1026" o:spid="_x0000_s1026" o:spt="202" type="#_x0000_t202" style="position:absolute;left:0pt;margin-left:68.65pt;margin-top:6.45pt;height:26.9pt;width:149pt;z-index:251676672;mso-width-relative:page;mso-height-relative:page;" filled="f" stroked="f" coordsize="21600,21600" o:gfxdata="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">
+              <v:shape id="_x0000_s1026" o:spid="_x0000_s1026" o:spt="202" type="#_x0000_t202" style="position:absolute;left:0pt;margin-left:68.65pt;margin-top:6.45pt;height:26.9pt;width:218.8pt;z-index:251676672;mso-width-relative:page;mso-height-relative:page;" filled="f" stroked="f" coordsize="21600,21600" o:gfxdata="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">
                 <v:fill on="f" focussize="0,0"/>
                 <v:stroke on="f" weight="0.5pt"/>
                 <v:imagedata o:title=""/>
@@ -577,6 +588,17 @@
                 <v:textbox>
                   <w:txbxContent>
                     <w:p>
+                      <w:r>
+                        <w:rPr>
+                          <w:rFonts w:hint="default" w:ascii="Arial" w:hAnsi="Arial" w:cs="Arial"/>
+                          <w:b/>
+                          <w:color w:val="FF0000"/>
+                          <w:sz w:val="32"/>
+                          <w:szCs w:val="32"/>
+                          <w:lang w:val="en-US"/>
+                        </w:rPr>
+                        <w:t>R10-</w:t>
+                      </w:r>
                       <w:r>
                         <w:rPr>
                           <w:rFonts w:ascii="Arial" w:hAnsi="Arial" w:cs="Arial"/>
@@ -1074,6 +1096,8 @@
         </w:rPr>
         <w:t>FIRE SAFETY INSPECTION CERTIFICATE</w:t>
       </w:r>
+      <w:bookmarkStart w:id="1" w:name="_GoBack"/>
+      <w:bookmarkEnd w:id="1"/>
     </w:p>
     <w:p>
       <w:pPr>
@@ -2890,8 +2914,6 @@
         </w:rPr>
         <w:t xml:space="preserve"> after said building structure or facility has been duly inspected with the finding that it has fully complied with the fire safety and protection requirements of the Fire Code of the Philippines of 2008 and its Revised Implementing Rules and Regulations.</w:t>
       </w:r>
-      <w:bookmarkStart w:id="1" w:name="_GoBack"/>
-      <w:bookmarkEnd w:id="1"/>
     </w:p>
     <w:p>
       <w:pPr>
@@ -5074,7 +5096,7 @@
           </mc:Choice>
           <mc:Fallback>
             <w:pict>
-              <v:shape id="_x0000_s1026" o:spid="_x0000_s1026" o:spt="202" type="#_x0000_t202" style="position:absolute;left:0pt;margin-left:225.45pt;margin-top:2.05pt;height:21.75pt;width:244.05pt;mso-position-horizontal-relative:margin;z-index:-251650048;mso-width-relative:page;mso-height-relative:page;" filled="f" stroked="f" coordsize="21600,21600" o:gfxdata="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">
+              <v:shape id="_x0000_s1026" o:spid="_x0000_s1026" o:spt="202" type="#_x0000_t202" style="position:absolute;left:0pt;margin-left:225.45pt;margin-top:2.05pt;height:21.75pt;width:244.05pt;mso-position-horizontal-relative:margin;z-index:-251650048;mso-width-relative:page;mso-height-relative:page;" filled="f" stroked="f" coordsize="21600,21600" o:gfxdata="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">
                 <v:fill on="f" focussize="0,0"/>
                 <v:stroke on="f" weight="0.5pt"/>
                 <v:imagedata o:title=""/>

</xml_diff>

<commit_message>
template fixes, add records input fields adds
</commit_message>
<xml_diff>
--- a/backend/templates/fsic-bfp.docx
+++ b/backend/templates/fsic-bfp.docx
@@ -1229,8 +1229,6 @@
         </w:rPr>
         <w:tab/>
       </w:r>
-      <w:bookmarkStart w:id="1" w:name="_GoBack"/>
-      <w:bookmarkEnd w:id="1"/>
     </w:p>
     <w:p>
       <w:pPr>
@@ -1406,7 +1404,7 @@
           <w:sz w:val="24"/>
           <w:szCs w:val="24"/>
         </w:rPr>
-        <w:t xml:space="preserve">                                     FOR BUSINESS PERMIT (NEW/</w:t>
+        <w:t xml:space="preserve">                                     FOR BUSINESS PERMIT (</w:t>
       </w:r>
       <w:r>
         <w:rPr>
@@ -1416,6 +1414,27 @@
           <w:sz w:val="24"/>
           <w:szCs w:val="24"/>
           <w:u w:val="single"/>
+        </w:rPr>
+        <w:t>NEW</w:t>
+      </w:r>
+      <w:r>
+        <w:rPr>
+          <w:rFonts w:ascii="Arial" w:hAnsi="Arial" w:cs="Arial"/>
+          <w:b/>
+          <w:color w:val="17375E" w:themeColor="text2" w:themeShade="BF"/>
+          <w:sz w:val="24"/>
+          <w:szCs w:val="24"/>
+        </w:rPr>
+        <w:t>/</w:t>
+      </w:r>
+      <w:r>
+        <w:rPr>
+          <w:rFonts w:ascii="Arial" w:hAnsi="Arial" w:cs="Arial"/>
+          <w:b/>
+          <w:color w:val="17375E" w:themeColor="text2" w:themeShade="BF"/>
+          <w:sz w:val="24"/>
+          <w:szCs w:val="24"/>
+          <w:u w:val="none"/>
         </w:rPr>
         <w:t>RENEWAL</w:t>
       </w:r>
@@ -4216,12 +4235,12 @@
               <wp:anchor distT="0" distB="0" distL="114300" distR="114300" simplePos="0" relativeHeight="251678720" behindDoc="1" locked="0" layoutInCell="1" allowOverlap="1">
                 <wp:simplePos x="0" y="0"/>
                 <wp:positionH relativeFrom="column">
-                  <wp:posOffset>2988310</wp:posOffset>
+                  <wp:posOffset>2889250</wp:posOffset>
                 </wp:positionH>
                 <wp:positionV relativeFrom="paragraph">
                   <wp:posOffset>79375</wp:posOffset>
                 </wp:positionV>
-                <wp:extent cx="2945765" cy="258445"/>
+                <wp:extent cx="3181985" cy="327660"/>
                 <wp:effectExtent l="0" t="0" r="0" b="0"/>
                 <wp:wrapNone/>
                 <wp:docPr id="20" name="Text Box 20"/>
@@ -4233,7 +4252,7 @@
                       <wps:spPr>
                         <a:xfrm>
                           <a:off x="0" y="0"/>
-                          <a:ext cx="2945765" cy="258445"/>
+                          <a:ext cx="3181985" cy="327660"/>
                         </a:xfrm>
                         <a:prstGeom prst="rect">
                           <a:avLst/>
@@ -4262,32 +4281,20 @@
                         <w:txbxContent>
                           <w:p>
                             <w:pPr>
-                              <w:spacing w:line="240" w:lineRule="auto"/>
                               <w:jc w:val="center"/>
                               <w:rPr>
-                                <w:rFonts w:eastAsia="Arial" w:cstheme="minorHAnsi"/>
+                                <w:rFonts w:hint="default" w:ascii="Arial" w:hAnsi="Arial" w:cs="Arial"/>
                                 <w:b/>
-                                <w:bCs/>
-                                <w:u w:val="single"/>
                               </w:rPr>
                             </w:pPr>
                             <w:r>
                               <w:rPr>
-                                <w:rFonts w:ascii="Arial" w:hAnsi="Arial" w:cs="Arial"/>
-                                <w:sz w:val="20"/>
-                                <w:szCs w:val="20"/>
-                              </w:rPr>
-                              <w:t>Chief, Fire Safety Enforcement Section</w:t>
-                            </w:r>
-                          </w:p>
-                          <w:p>
-                            <w:pPr>
-                              <w:jc w:val="center"/>
-                              <w:rPr>
-                                <w:rFonts w:cstheme="minorHAnsi"/>
-                                <w:b/>
-                              </w:rPr>
-                            </w:pPr>
+                                <w:rFonts w:hint="default" w:ascii="Arial" w:hAnsi="Arial" w:eastAsia="SimSun" w:cs="Arial"/>
+                                <w:sz w:val="24"/>
+                                <w:szCs w:val="24"/>
+                              </w:rPr>
+                              <w:t>{CHIEF_POSITION}</w:t>
+                            </w:r>
                           </w:p>
                         </w:txbxContent>
                       </wps:txbx>
@@ -4302,7 +4309,7 @@
           </mc:Choice>
           <mc:Fallback>
             <w:pict>
-              <v:shape id="_x0000_s1026" o:spid="_x0000_s1026" o:spt="202" type="#_x0000_t202" style="position:absolute;left:0pt;margin-left:235.3pt;margin-top:6.25pt;height:20.35pt;width:231.95pt;z-index:-251637760;mso-width-relative:page;mso-height-relative:page;" filled="f" stroked="f" coordsize="21600,21600" o:gfxdata="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">
+              <v:shape id="_x0000_s1026" o:spid="_x0000_s1026" o:spt="202" type="#_x0000_t202" style="position:absolute;left:0pt;margin-left:227.5pt;margin-top:6.25pt;height:25.8pt;width:250.55pt;z-index:-251637760;mso-width-relative:page;mso-height-relative:page;" filled="f" stroked="f" coordsize="21600,21600" o:gfxdata="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">
                 <v:fill on="f" focussize="0,0"/>
                 <v:stroke on="f" weight="0.5pt"/>
                 <v:imagedata o:title=""/>
@@ -4311,32 +4318,20 @@
                   <w:txbxContent>
                     <w:p>
                       <w:pPr>
-                        <w:spacing w:line="240" w:lineRule="auto"/>
                         <w:jc w:val="center"/>
                         <w:rPr>
-                          <w:rFonts w:eastAsia="Arial" w:cstheme="minorHAnsi"/>
+                          <w:rFonts w:hint="default" w:ascii="Arial" w:hAnsi="Arial" w:cs="Arial"/>
                           <w:b/>
-                          <w:bCs/>
-                          <w:u w:val="single"/>
                         </w:rPr>
                       </w:pPr>
                       <w:r>
                         <w:rPr>
-                          <w:rFonts w:ascii="Arial" w:hAnsi="Arial" w:cs="Arial"/>
-                          <w:sz w:val="20"/>
-                          <w:szCs w:val="20"/>
-                        </w:rPr>
-                        <w:t>Chief, Fire Safety Enforcement Section</w:t>
-                      </w:r>
-                    </w:p>
-                    <w:p>
-                      <w:pPr>
-                        <w:jc w:val="center"/>
-                        <w:rPr>
-                          <w:rFonts w:cstheme="minorHAnsi"/>
-                          <w:b/>
-                        </w:rPr>
-                      </w:pPr>
+                          <w:rFonts w:hint="default" w:ascii="Arial" w:hAnsi="Arial" w:eastAsia="SimSun" w:cs="Arial"/>
+                          <w:sz w:val="24"/>
+                          <w:szCs w:val="24"/>
+                        </w:rPr>
+                        <w:t>{CHIEF_POSITION}</w:t>
+                      </w:r>
                     </w:p>
                   </w:txbxContent>
                 </v:textbox>
@@ -5622,7 +5617,17 @@
           <w:sz w:val="20"/>
           <w:szCs w:val="20"/>
         </w:rPr>
-        <w:t xml:space="preserve">                           </w:t>
+        <w:t xml:space="preserve">     </w:t>
+      </w:r>
+      <w:bookmarkStart w:id="1" w:name="_GoBack"/>
+      <w:bookmarkEnd w:id="1"/>
+      <w:r>
+        <w:rPr>
+          <w:rFonts w:ascii="Arial" w:hAnsi="Arial" w:cs="Arial"/>
+          <w:sz w:val="20"/>
+          <w:szCs w:val="20"/>
+        </w:rPr>
+        <w:t xml:space="preserve">                      </w:t>
       </w:r>
       <w:r>
         <w:rPr>

</xml_diff>